<commit_message>
horas extras de asistencia y manfiiestos
</commit_message>
<xml_diff>
--- a/templates/REPORTE_MOVIMIENTO_ALMACEN_WORD.docx
+++ b/templates/REPORTE_MOVIMIENTO_ALMACEN_WORD.docx
@@ -36,13 +36,13 @@
         <w:tblLook w:val="04A0" w:firstRow="1" w:lastRow="0" w:firstColumn="1" w:lastColumn="0" w:noHBand="0" w:noVBand="1"/>
       </w:tblPr>
       <w:tblGrid>
-        <w:gridCol w:w="3401"/>
-        <w:gridCol w:w="827"/>
-        <w:gridCol w:w="662"/>
-        <w:gridCol w:w="889"/>
-        <w:gridCol w:w="1994"/>
-        <w:gridCol w:w="1207"/>
-        <w:gridCol w:w="1647"/>
+        <w:gridCol w:w="3847"/>
+        <w:gridCol w:w="693"/>
+        <w:gridCol w:w="566"/>
+        <w:gridCol w:w="745"/>
+        <w:gridCol w:w="2098"/>
+        <w:gridCol w:w="1261"/>
+        <w:gridCol w:w="1417"/>
       </w:tblGrid>
       <w:tr>
         <w:trPr>
@@ -119,8 +119,8 @@
                 <w:rFonts w:ascii="Nirmala UI" w:hAnsi="Nirmala UI" w:cs="Nirmala UI"/>
                 <w:b/>
                 <w:bCs/>
-                <w:sz w:val="18"/>
-                <w:szCs w:val="18"/>
+                <w:sz w:val="16"/>
+                <w:szCs w:val="16"/>
               </w:rPr>
               <w:t>o</w:t>
             </w:r>
@@ -252,12 +252,16 @@
               <w:rPr>
                 <w:rFonts w:ascii="Nirmala UI" w:hAnsi="Nirmala UI" w:cs="Nirmala UI"/>
                 <w:color w:val="002060"/>
-              </w:rPr>
-            </w:pPr>
-            <w:r>
-              <w:rPr>
-                <w:rFonts w:ascii="Nirmala UI" w:hAnsi="Nirmala UI" w:cs="Nirmala UI"/>
-                <w:color w:val="002060"/>
+                <w:sz w:val="18"/>
+                <w:szCs w:val="18"/>
+              </w:rPr>
+            </w:pPr>
+            <w:r>
+              <w:rPr>
+                <w:rFonts w:ascii="Nirmala UI" w:hAnsi="Nirmala UI" w:cs="Nirmala UI"/>
+                <w:color w:val="002060"/>
+                <w:sz w:val="18"/>
+                <w:szCs w:val="18"/>
               </w:rPr>
               <w:t>{{contribuyente}}</w:t>
             </w:r>
@@ -275,12 +279,16 @@
               <w:rPr>
                 <w:rFonts w:ascii="Nirmala UI" w:hAnsi="Nirmala UI" w:cs="Nirmala UI"/>
                 <w:color w:val="002060"/>
-              </w:rPr>
-            </w:pPr>
-            <w:r>
-              <w:rPr>
-                <w:rFonts w:ascii="Nirmala UI" w:hAnsi="Nirmala UI" w:cs="Nirmala UI"/>
-                <w:color w:val="002060"/>
+                <w:sz w:val="18"/>
+                <w:szCs w:val="18"/>
+              </w:rPr>
+            </w:pPr>
+            <w:r>
+              <w:rPr>
+                <w:rFonts w:ascii="Nirmala UI" w:hAnsi="Nirmala UI" w:cs="Nirmala UI"/>
+                <w:color w:val="002060"/>
+                <w:sz w:val="18"/>
+                <w:szCs w:val="18"/>
               </w:rPr>
               <w:t>{{</w:t>
             </w:r>
@@ -289,21 +297,18 @@
               <w:rPr>
                 <w:rFonts w:ascii="Nirmala UI" w:hAnsi="Nirmala UI" w:cs="Nirmala UI"/>
                 <w:color w:val="002060"/>
-              </w:rPr>
-              <w:t>numeroD</w:t>
-            </w:r>
-            <w:r>
-              <w:rPr>
-                <w:rFonts w:ascii="Nirmala UI" w:hAnsi="Nirmala UI" w:cs="Nirmala UI"/>
-                <w:color w:val="002060"/>
-              </w:rPr>
-              <w:t>ocumento</w:t>
+                <w:sz w:val="18"/>
+                <w:szCs w:val="18"/>
+              </w:rPr>
+              <w:t>numeroDocumento</w:t>
             </w:r>
             <w:proofErr w:type="spellEnd"/>
             <w:r>
               <w:rPr>
                 <w:rFonts w:ascii="Nirmala UI" w:hAnsi="Nirmala UI" w:cs="Nirmala UI"/>
                 <w:color w:val="002060"/>
+                <w:sz w:val="18"/>
+                <w:szCs w:val="18"/>
               </w:rPr>
               <w:t>}}</w:t>
             </w:r>
@@ -320,12 +325,16 @@
               <w:rPr>
                 <w:rFonts w:ascii="Nirmala UI" w:hAnsi="Nirmala UI" w:cs="Nirmala UI"/>
                 <w:color w:val="002060"/>
-              </w:rPr>
-            </w:pPr>
-            <w:r>
-              <w:rPr>
-                <w:rFonts w:ascii="Nirmala UI" w:hAnsi="Nirmala UI" w:cs="Nirmala UI"/>
-                <w:color w:val="002060"/>
+                <w:sz w:val="18"/>
+                <w:szCs w:val="18"/>
+              </w:rPr>
+            </w:pPr>
+            <w:r>
+              <w:rPr>
+                <w:rFonts w:ascii="Nirmala UI" w:hAnsi="Nirmala UI" w:cs="Nirmala UI"/>
+                <w:color w:val="002060"/>
+                <w:sz w:val="18"/>
+                <w:szCs w:val="18"/>
               </w:rPr>
               <w:t>{{</w:t>
             </w:r>
@@ -334,6 +343,8 @@
               <w:rPr>
                 <w:rFonts w:ascii="Nirmala UI" w:hAnsi="Nirmala UI" w:cs="Nirmala UI"/>
                 <w:color w:val="002060"/>
+                <w:sz w:val="18"/>
+                <w:szCs w:val="18"/>
               </w:rPr>
               <w:t>actaIngreso</w:t>
             </w:r>
@@ -342,6 +353,8 @@
               <w:rPr>
                 <w:rFonts w:ascii="Nirmala UI" w:hAnsi="Nirmala UI" w:cs="Nirmala UI"/>
                 <w:color w:val="002060"/>
+                <w:sz w:val="18"/>
+                <w:szCs w:val="18"/>
               </w:rPr>
               <w:t>}}</w:t>
             </w:r>
@@ -358,12 +371,16 @@
               <w:rPr>
                 <w:rFonts w:ascii="Nirmala UI" w:hAnsi="Nirmala UI" w:cs="Nirmala UI"/>
                 <w:color w:val="002060"/>
-              </w:rPr>
-            </w:pPr>
-            <w:r>
-              <w:rPr>
-                <w:rFonts w:ascii="Nirmala UI" w:hAnsi="Nirmala UI" w:cs="Nirmala UI"/>
-                <w:color w:val="002060"/>
+                <w:sz w:val="18"/>
+                <w:szCs w:val="18"/>
+              </w:rPr>
+            </w:pPr>
+            <w:r>
+              <w:rPr>
+                <w:rFonts w:ascii="Nirmala UI" w:hAnsi="Nirmala UI" w:cs="Nirmala UI"/>
+                <w:color w:val="002060"/>
+                <w:sz w:val="18"/>
+                <w:szCs w:val="18"/>
               </w:rPr>
               <w:t>{{fecha}}</w:t>
             </w:r>
@@ -380,12 +397,16 @@
               <w:rPr>
                 <w:rFonts w:ascii="Nirmala UI" w:hAnsi="Nirmala UI" w:cs="Nirmala UI"/>
                 <w:color w:val="002060"/>
-              </w:rPr>
-            </w:pPr>
-            <w:r>
-              <w:rPr>
-                <w:rFonts w:ascii="Nirmala UI" w:hAnsi="Nirmala UI" w:cs="Nirmala UI"/>
-                <w:color w:val="002060"/>
+                <w:sz w:val="18"/>
+                <w:szCs w:val="18"/>
+              </w:rPr>
+            </w:pPr>
+            <w:r>
+              <w:rPr>
+                <w:rFonts w:ascii="Nirmala UI" w:hAnsi="Nirmala UI" w:cs="Nirmala UI"/>
+                <w:color w:val="002060"/>
+                <w:sz w:val="18"/>
+                <w:szCs w:val="18"/>
               </w:rPr>
               <w:t>{{</w:t>
             </w:r>
@@ -394,6 +415,8 @@
               <w:rPr>
                 <w:rFonts w:ascii="Nirmala UI" w:hAnsi="Nirmala UI" w:cs="Nirmala UI"/>
                 <w:color w:val="002060"/>
+                <w:sz w:val="18"/>
+                <w:szCs w:val="18"/>
               </w:rPr>
               <w:t>horaIngreso</w:t>
             </w:r>
@@ -402,6 +425,8 @@
               <w:rPr>
                 <w:rFonts w:ascii="Nirmala UI" w:hAnsi="Nirmala UI" w:cs="Nirmala UI"/>
                 <w:color w:val="002060"/>
+                <w:sz w:val="18"/>
+                <w:szCs w:val="18"/>
               </w:rPr>
               <w:t>}}</w:t>
             </w:r>
@@ -594,12 +619,16 @@
               <w:rPr>
                 <w:rFonts w:ascii="Nirmala UI" w:hAnsi="Nirmala UI" w:cs="Nirmala UI"/>
                 <w:color w:val="002060"/>
-              </w:rPr>
-            </w:pPr>
-            <w:r>
-              <w:rPr>
-                <w:rFonts w:ascii="Nirmala UI" w:hAnsi="Nirmala UI" w:cs="Nirmala UI"/>
-                <w:color w:val="002060"/>
+                <w:sz w:val="18"/>
+                <w:szCs w:val="18"/>
+              </w:rPr>
+            </w:pPr>
+            <w:r>
+              <w:rPr>
+                <w:rFonts w:ascii="Nirmala UI" w:hAnsi="Nirmala UI" w:cs="Nirmala UI"/>
+                <w:color w:val="002060"/>
+                <w:sz w:val="18"/>
+                <w:szCs w:val="18"/>
               </w:rPr>
               <w:t>{{</w:t>
             </w:r>
@@ -608,6 +637,8 @@
               <w:rPr>
                 <w:rFonts w:ascii="Nirmala UI" w:hAnsi="Nirmala UI" w:cs="Nirmala UI"/>
                 <w:color w:val="002060"/>
+                <w:sz w:val="18"/>
+                <w:szCs w:val="18"/>
               </w:rPr>
               <w:t>responsableRecepcion</w:t>
             </w:r>
@@ -616,6 +647,8 @@
               <w:rPr>
                 <w:rFonts w:ascii="Nirmala UI" w:hAnsi="Nirmala UI" w:cs="Nirmala UI"/>
                 <w:color w:val="002060"/>
+                <w:sz w:val="18"/>
+                <w:szCs w:val="18"/>
               </w:rPr>
               <w:t>}}</w:t>
             </w:r>
@@ -632,12 +665,16 @@
               <w:rPr>
                 <w:rFonts w:ascii="Nirmala UI" w:hAnsi="Nirmala UI" w:cs="Nirmala UI"/>
                 <w:color w:val="002060"/>
-              </w:rPr>
-            </w:pPr>
-            <w:r>
-              <w:rPr>
-                <w:rFonts w:ascii="Nirmala UI" w:hAnsi="Nirmala UI" w:cs="Nirmala UI"/>
-                <w:color w:val="002060"/>
+                <w:sz w:val="18"/>
+                <w:szCs w:val="18"/>
+              </w:rPr>
+            </w:pPr>
+            <w:r>
+              <w:rPr>
+                <w:rFonts w:ascii="Nirmala UI" w:hAnsi="Nirmala UI" w:cs="Nirmala UI"/>
+                <w:color w:val="002060"/>
+                <w:sz w:val="18"/>
+                <w:szCs w:val="18"/>
               </w:rPr>
               <w:t>{{</w:t>
             </w:r>
@@ -646,6 +683,8 @@
               <w:rPr>
                 <w:rFonts w:ascii="Nirmala UI" w:hAnsi="Nirmala UI" w:cs="Nirmala UI"/>
                 <w:color w:val="002060"/>
+                <w:sz w:val="18"/>
+                <w:szCs w:val="18"/>
               </w:rPr>
               <w:t>dni</w:t>
             </w:r>
@@ -654,6 +693,8 @@
               <w:rPr>
                 <w:rFonts w:ascii="Nirmala UI" w:hAnsi="Nirmala UI" w:cs="Nirmala UI"/>
                 <w:color w:val="002060"/>
+                <w:sz w:val="18"/>
+                <w:szCs w:val="18"/>
               </w:rPr>
               <w:t>}}</w:t>
             </w:r>
@@ -670,12 +711,16 @@
               <w:rPr>
                 <w:rFonts w:ascii="Nirmala UI" w:hAnsi="Nirmala UI" w:cs="Nirmala UI"/>
                 <w:color w:val="002060"/>
-              </w:rPr>
-            </w:pPr>
-            <w:r>
-              <w:rPr>
-                <w:rFonts w:ascii="Nirmala UI" w:hAnsi="Nirmala UI" w:cs="Nirmala UI"/>
-                <w:color w:val="002060"/>
+                <w:sz w:val="18"/>
+                <w:szCs w:val="18"/>
+              </w:rPr>
+            </w:pPr>
+            <w:r>
+              <w:rPr>
+                <w:rFonts w:ascii="Nirmala UI" w:hAnsi="Nirmala UI" w:cs="Nirmala UI"/>
+                <w:color w:val="002060"/>
+                <w:sz w:val="18"/>
+                <w:szCs w:val="18"/>
               </w:rPr>
               <w:t>{{</w:t>
             </w:r>
@@ -684,6 +729,8 @@
               <w:rPr>
                 <w:rFonts w:ascii="Nirmala UI" w:hAnsi="Nirmala UI" w:cs="Nirmala UI"/>
                 <w:color w:val="002060"/>
+                <w:sz w:val="18"/>
+                <w:szCs w:val="18"/>
               </w:rPr>
               <w:t>responsableEntrega</w:t>
             </w:r>
@@ -692,6 +739,8 @@
               <w:rPr>
                 <w:rFonts w:ascii="Nirmala UI" w:hAnsi="Nirmala UI" w:cs="Nirmala UI"/>
                 <w:color w:val="002060"/>
+                <w:sz w:val="18"/>
+                <w:szCs w:val="18"/>
               </w:rPr>
               <w:t>}}</w:t>
             </w:r>
@@ -708,12 +757,16 @@
               <w:rPr>
                 <w:rFonts w:ascii="Nirmala UI" w:hAnsi="Nirmala UI" w:cs="Nirmala UI"/>
                 <w:color w:val="002060"/>
-              </w:rPr>
-            </w:pPr>
-            <w:r>
-              <w:rPr>
-                <w:rFonts w:ascii="Nirmala UI" w:hAnsi="Nirmala UI" w:cs="Nirmala UI"/>
-                <w:color w:val="002060"/>
+                <w:sz w:val="18"/>
+                <w:szCs w:val="18"/>
+              </w:rPr>
+            </w:pPr>
+            <w:r>
+              <w:rPr>
+                <w:rFonts w:ascii="Nirmala UI" w:hAnsi="Nirmala UI" w:cs="Nirmala UI"/>
+                <w:color w:val="002060"/>
+                <w:sz w:val="18"/>
+                <w:szCs w:val="18"/>
               </w:rPr>
               <w:t>{{</w:t>
             </w:r>
@@ -722,6 +775,8 @@
               <w:rPr>
                 <w:rFonts w:ascii="Nirmala UI" w:hAnsi="Nirmala UI" w:cs="Nirmala UI"/>
                 <w:color w:val="002060"/>
+                <w:sz w:val="18"/>
+                <w:szCs w:val="18"/>
               </w:rPr>
               <w:t>cip</w:t>
             </w:r>
@@ -730,6 +785,8 @@
               <w:rPr>
                 <w:rFonts w:ascii="Nirmala UI" w:hAnsi="Nirmala UI" w:cs="Nirmala UI"/>
                 <w:color w:val="002060"/>
+                <w:sz w:val="18"/>
+                <w:szCs w:val="18"/>
               </w:rPr>
               <w:t>}}</w:t>
             </w:r>
@@ -746,12 +803,16 @@
               <w:rPr>
                 <w:rFonts w:ascii="Nirmala UI" w:hAnsi="Nirmala UI" w:cs="Nirmala UI"/>
                 <w:color w:val="002060"/>
-              </w:rPr>
-            </w:pPr>
-            <w:r>
-              <w:rPr>
-                <w:rFonts w:ascii="Nirmala UI" w:hAnsi="Nirmala UI" w:cs="Nirmala UI"/>
-                <w:color w:val="002060"/>
+                <w:sz w:val="18"/>
+                <w:szCs w:val="18"/>
+              </w:rPr>
+            </w:pPr>
+            <w:r>
+              <w:rPr>
+                <w:rFonts w:ascii="Nirmala UI" w:hAnsi="Nirmala UI" w:cs="Nirmala UI"/>
+                <w:color w:val="002060"/>
+                <w:sz w:val="18"/>
+                <w:szCs w:val="18"/>
               </w:rPr>
               <w:t>{{</w:t>
             </w:r>
@@ -760,6 +821,8 @@
               <w:rPr>
                 <w:rFonts w:ascii="Nirmala UI" w:hAnsi="Nirmala UI" w:cs="Nirmala UI"/>
                 <w:color w:val="002060"/>
+                <w:sz w:val="18"/>
+                <w:szCs w:val="18"/>
               </w:rPr>
               <w:t>estadoActa</w:t>
             </w:r>
@@ -768,6 +831,8 @@
               <w:rPr>
                 <w:rFonts w:ascii="Nirmala UI" w:hAnsi="Nirmala UI" w:cs="Nirmala UI"/>
                 <w:color w:val="002060"/>
+                <w:sz w:val="18"/>
+                <w:szCs w:val="18"/>
               </w:rPr>
               <w:t>}}</w:t>
             </w:r>
@@ -811,18 +876,18 @@
         <w:tblLook w:val="04A0" w:firstRow="1" w:lastRow="0" w:firstColumn="1" w:lastColumn="0" w:noHBand="0" w:noVBand="1"/>
       </w:tblPr>
       <w:tblGrid>
-        <w:gridCol w:w="562"/>
-        <w:gridCol w:w="851"/>
-        <w:gridCol w:w="958"/>
-        <w:gridCol w:w="3011"/>
+        <w:gridCol w:w="704"/>
+        <w:gridCol w:w="709"/>
+        <w:gridCol w:w="1134"/>
+        <w:gridCol w:w="3260"/>
         <w:gridCol w:w="1134"/>
         <w:gridCol w:w="1134"/>
         <w:gridCol w:w="425"/>
+        <w:gridCol w:w="426"/>
+        <w:gridCol w:w="425"/>
+        <w:gridCol w:w="425"/>
         <w:gridCol w:w="425"/>
         <w:gridCol w:w="426"/>
-        <w:gridCol w:w="567"/>
-        <w:gridCol w:w="567"/>
-        <w:gridCol w:w="567"/>
       </w:tblGrid>
       <w:tr>
         <w:trPr>
@@ -831,7 +896,7 @@
         </w:trPr>
         <w:tc>
           <w:tcPr>
-            <w:tcW w:w="562" w:type="dxa"/>
+            <w:tcW w:w="704" w:type="dxa"/>
             <w:vMerge w:val="restart"/>
             <w:shd w:val="clear" w:color="auto" w:fill="F2F2F2" w:themeFill="background1" w:themeFillShade="F2"/>
             <w:vAlign w:val="center"/>
@@ -857,7 +922,7 @@
         </w:tc>
         <w:tc>
           <w:tcPr>
-            <w:tcW w:w="851" w:type="dxa"/>
+            <w:tcW w:w="709" w:type="dxa"/>
             <w:vMerge w:val="restart"/>
             <w:shd w:val="clear" w:color="auto" w:fill="F2F2F2" w:themeFill="background1" w:themeFillShade="F2"/>
             <w:textDirection w:val="btLr"/>
@@ -885,58 +950,6 @@
         </w:tc>
         <w:tc>
           <w:tcPr>
-            <w:tcW w:w="958" w:type="dxa"/>
-            <w:vMerge w:val="restart"/>
-            <w:shd w:val="clear" w:color="auto" w:fill="F2F2F2" w:themeFill="background1" w:themeFillShade="F2"/>
-            <w:vAlign w:val="center"/>
-          </w:tcPr>
-          <w:p>
-            <w:pPr>
-              <w:jc w:val="center"/>
-              <w:rPr>
-                <w:rFonts w:ascii="Nirmala UI" w:hAnsi="Nirmala UI" w:cs="Nirmala UI"/>
-                <w:sz w:val="16"/>
-                <w:szCs w:val="16"/>
-              </w:rPr>
-            </w:pPr>
-            <w:r>
-              <w:rPr>
-                <w:rFonts w:ascii="Nirmala UI" w:hAnsi="Nirmala UI" w:cs="Nirmala UI"/>
-                <w:sz w:val="16"/>
-                <w:szCs w:val="16"/>
-              </w:rPr>
-              <w:t>UNIDAD DE MEDIDA</w:t>
-            </w:r>
-          </w:p>
-        </w:tc>
-        <w:tc>
-          <w:tcPr>
-            <w:tcW w:w="3011" w:type="dxa"/>
-            <w:vMerge w:val="restart"/>
-            <w:shd w:val="clear" w:color="auto" w:fill="F2F2F2" w:themeFill="background1" w:themeFillShade="F2"/>
-            <w:vAlign w:val="center"/>
-          </w:tcPr>
-          <w:p>
-            <w:pPr>
-              <w:jc w:val="center"/>
-              <w:rPr>
-                <w:rFonts w:ascii="Nirmala UI" w:hAnsi="Nirmala UI" w:cs="Nirmala UI"/>
-                <w:sz w:val="17"/>
-                <w:szCs w:val="17"/>
-              </w:rPr>
-            </w:pPr>
-            <w:r>
-              <w:rPr>
-                <w:rFonts w:ascii="Nirmala UI" w:hAnsi="Nirmala UI" w:cs="Nirmala UI"/>
-                <w:sz w:val="17"/>
-                <w:szCs w:val="17"/>
-              </w:rPr>
-              <w:t>DESCRIPCION DE LOS INSUMOS QUIMICOS</w:t>
-            </w:r>
-          </w:p>
-        </w:tc>
-        <w:tc>
-          <w:tcPr>
             <w:tcW w:w="1134" w:type="dxa"/>
             <w:vMerge w:val="restart"/>
             <w:shd w:val="clear" w:color="auto" w:fill="F2F2F2" w:themeFill="background1" w:themeFillShade="F2"/>
@@ -957,23 +970,33 @@
                 <w:sz w:val="16"/>
                 <w:szCs w:val="16"/>
               </w:rPr>
-              <w:t xml:space="preserve">PESO NETO </w:t>
-            </w:r>
-            <w:r>
-              <w:rPr>
-                <w:rFonts w:ascii="Nirmala UI" w:hAnsi="Nirmala UI" w:cs="Nirmala UI"/>
-                <w:sz w:val="16"/>
-                <w:szCs w:val="16"/>
-              </w:rPr>
-              <w:br/>
-            </w:r>
-            <w:r>
-              <w:rPr>
-                <w:rFonts w:ascii="Nirmala UI" w:hAnsi="Nirmala UI" w:cs="Nirmala UI"/>
-                <w:sz w:val="16"/>
-                <w:szCs w:val="16"/>
-              </w:rPr>
-              <w:t>(Kg)</w:t>
+              <w:t>UNIDAD DE MEDIDA</w:t>
+            </w:r>
+          </w:p>
+        </w:tc>
+        <w:tc>
+          <w:tcPr>
+            <w:tcW w:w="3260" w:type="dxa"/>
+            <w:vMerge w:val="restart"/>
+            <w:shd w:val="clear" w:color="auto" w:fill="F2F2F2" w:themeFill="background1" w:themeFillShade="F2"/>
+            <w:vAlign w:val="center"/>
+          </w:tcPr>
+          <w:p>
+            <w:pPr>
+              <w:jc w:val="center"/>
+              <w:rPr>
+                <w:rFonts w:ascii="Nirmala UI" w:hAnsi="Nirmala UI" w:cs="Nirmala UI"/>
+                <w:sz w:val="16"/>
+                <w:szCs w:val="16"/>
+              </w:rPr>
+            </w:pPr>
+            <w:r>
+              <w:rPr>
+                <w:rFonts w:ascii="Nirmala UI" w:hAnsi="Nirmala UI" w:cs="Nirmala UI"/>
+                <w:sz w:val="16"/>
+                <w:szCs w:val="16"/>
+              </w:rPr>
+              <w:t>DESCRIPCION DE LOS INSUMOS QUIMICOS</w:t>
             </w:r>
           </w:p>
         </w:tc>
@@ -999,6 +1022,48 @@
                 <w:sz w:val="16"/>
                 <w:szCs w:val="16"/>
               </w:rPr>
+              <w:t xml:space="preserve">PESO NETO </w:t>
+            </w:r>
+            <w:r>
+              <w:rPr>
+                <w:rFonts w:ascii="Nirmala UI" w:hAnsi="Nirmala UI" w:cs="Nirmala UI"/>
+                <w:sz w:val="16"/>
+                <w:szCs w:val="16"/>
+              </w:rPr>
+              <w:br/>
+            </w:r>
+            <w:r>
+              <w:rPr>
+                <w:rFonts w:ascii="Nirmala UI" w:hAnsi="Nirmala UI" w:cs="Nirmala UI"/>
+                <w:sz w:val="16"/>
+                <w:szCs w:val="16"/>
+              </w:rPr>
+              <w:t>(Kg)</w:t>
+            </w:r>
+          </w:p>
+        </w:tc>
+        <w:tc>
+          <w:tcPr>
+            <w:tcW w:w="1134" w:type="dxa"/>
+            <w:vMerge w:val="restart"/>
+            <w:shd w:val="clear" w:color="auto" w:fill="F2F2F2" w:themeFill="background1" w:themeFillShade="F2"/>
+            <w:vAlign w:val="center"/>
+          </w:tcPr>
+          <w:p>
+            <w:pPr>
+              <w:jc w:val="center"/>
+              <w:rPr>
+                <w:rFonts w:ascii="Nirmala UI" w:hAnsi="Nirmala UI" w:cs="Nirmala UI"/>
+                <w:sz w:val="16"/>
+                <w:szCs w:val="16"/>
+              </w:rPr>
+            </w:pPr>
+            <w:r>
+              <w:rPr>
+                <w:rFonts w:ascii="Nirmala UI" w:hAnsi="Nirmala UI" w:cs="Nirmala UI"/>
+                <w:sz w:val="16"/>
+                <w:szCs w:val="16"/>
+              </w:rPr>
               <w:t>PESO BRUTO (Kg)</w:t>
             </w:r>
           </w:p>
@@ -1031,7 +1096,7 @@
         </w:tc>
         <w:tc>
           <w:tcPr>
-            <w:tcW w:w="1701" w:type="dxa"/>
+            <w:tcW w:w="1276" w:type="dxa"/>
             <w:gridSpan w:val="3"/>
             <w:shd w:val="clear" w:color="auto" w:fill="F2F2F2" w:themeFill="background1" w:themeFillShade="F2"/>
             <w:vAlign w:val="center"/>
@@ -1063,7 +1128,7 @@
         </w:trPr>
         <w:tc>
           <w:tcPr>
-            <w:tcW w:w="562" w:type="dxa"/>
+            <w:tcW w:w="704" w:type="dxa"/>
             <w:vMerge/>
             <w:shd w:val="clear" w:color="auto" w:fill="F2F2F2" w:themeFill="background1" w:themeFillShade="F2"/>
             <w:vAlign w:val="center"/>
@@ -1073,15 +1138,15 @@
               <w:jc w:val="center"/>
               <w:rPr>
                 <w:rFonts w:ascii="Nirmala UI" w:hAnsi="Nirmala UI" w:cs="Nirmala UI"/>
-                <w:sz w:val="18"/>
-                <w:szCs w:val="18"/>
-              </w:rPr>
-            </w:pPr>
-          </w:p>
-        </w:tc>
-        <w:tc>
-          <w:tcPr>
-            <w:tcW w:w="851" w:type="dxa"/>
+                <w:sz w:val="16"/>
+                <w:szCs w:val="16"/>
+              </w:rPr>
+            </w:pPr>
+          </w:p>
+        </w:tc>
+        <w:tc>
+          <w:tcPr>
+            <w:tcW w:w="709" w:type="dxa"/>
             <w:vMerge/>
             <w:shd w:val="clear" w:color="auto" w:fill="F2F2F2" w:themeFill="background1" w:themeFillShade="F2"/>
             <w:vAlign w:val="center"/>
@@ -1091,44 +1156,8 @@
               <w:jc w:val="center"/>
               <w:rPr>
                 <w:rFonts w:ascii="Nirmala UI" w:hAnsi="Nirmala UI" w:cs="Nirmala UI"/>
-                <w:sz w:val="18"/>
-                <w:szCs w:val="18"/>
-              </w:rPr>
-            </w:pPr>
-          </w:p>
-        </w:tc>
-        <w:tc>
-          <w:tcPr>
-            <w:tcW w:w="958" w:type="dxa"/>
-            <w:vMerge/>
-            <w:shd w:val="clear" w:color="auto" w:fill="F2F2F2" w:themeFill="background1" w:themeFillShade="F2"/>
-            <w:vAlign w:val="center"/>
-          </w:tcPr>
-          <w:p>
-            <w:pPr>
-              <w:jc w:val="center"/>
-              <w:rPr>
-                <w:rFonts w:ascii="Nirmala UI" w:hAnsi="Nirmala UI" w:cs="Nirmala UI"/>
-                <w:sz w:val="18"/>
-                <w:szCs w:val="18"/>
-              </w:rPr>
-            </w:pPr>
-          </w:p>
-        </w:tc>
-        <w:tc>
-          <w:tcPr>
-            <w:tcW w:w="3011" w:type="dxa"/>
-            <w:vMerge/>
-            <w:shd w:val="clear" w:color="auto" w:fill="F2F2F2" w:themeFill="background1" w:themeFillShade="F2"/>
-            <w:vAlign w:val="center"/>
-          </w:tcPr>
-          <w:p>
-            <w:pPr>
-              <w:jc w:val="center"/>
-              <w:rPr>
-                <w:rFonts w:ascii="Nirmala UI" w:hAnsi="Nirmala UI" w:cs="Nirmala UI"/>
-                <w:sz w:val="18"/>
-                <w:szCs w:val="18"/>
+                <w:sz w:val="16"/>
+                <w:szCs w:val="16"/>
               </w:rPr>
             </w:pPr>
           </w:p>
@@ -1145,8 +1174,26 @@
               <w:jc w:val="center"/>
               <w:rPr>
                 <w:rFonts w:ascii="Nirmala UI" w:hAnsi="Nirmala UI" w:cs="Nirmala UI"/>
-                <w:sz w:val="18"/>
-                <w:szCs w:val="18"/>
+                <w:sz w:val="16"/>
+                <w:szCs w:val="16"/>
+              </w:rPr>
+            </w:pPr>
+          </w:p>
+        </w:tc>
+        <w:tc>
+          <w:tcPr>
+            <w:tcW w:w="3260" w:type="dxa"/>
+            <w:vMerge/>
+            <w:shd w:val="clear" w:color="auto" w:fill="F2F2F2" w:themeFill="background1" w:themeFillShade="F2"/>
+            <w:vAlign w:val="center"/>
+          </w:tcPr>
+          <w:p>
+            <w:pPr>
+              <w:jc w:val="center"/>
+              <w:rPr>
+                <w:rFonts w:ascii="Nirmala UI" w:hAnsi="Nirmala UI" w:cs="Nirmala UI"/>
+                <w:sz w:val="16"/>
+                <w:szCs w:val="16"/>
               </w:rPr>
             </w:pPr>
           </w:p>
@@ -1163,8 +1210,26 @@
               <w:jc w:val="center"/>
               <w:rPr>
                 <w:rFonts w:ascii="Nirmala UI" w:hAnsi="Nirmala UI" w:cs="Nirmala UI"/>
-                <w:sz w:val="18"/>
-                <w:szCs w:val="18"/>
+                <w:sz w:val="16"/>
+                <w:szCs w:val="16"/>
+              </w:rPr>
+            </w:pPr>
+          </w:p>
+        </w:tc>
+        <w:tc>
+          <w:tcPr>
+            <w:tcW w:w="1134" w:type="dxa"/>
+            <w:vMerge/>
+            <w:shd w:val="clear" w:color="auto" w:fill="F2F2F2" w:themeFill="background1" w:themeFillShade="F2"/>
+            <w:vAlign w:val="center"/>
+          </w:tcPr>
+          <w:p>
+            <w:pPr>
+              <w:jc w:val="center"/>
+              <w:rPr>
+                <w:rFonts w:ascii="Nirmala UI" w:hAnsi="Nirmala UI" w:cs="Nirmala UI"/>
+                <w:sz w:val="16"/>
+                <w:szCs w:val="16"/>
               </w:rPr>
             </w:pPr>
           </w:p>
@@ -1180,17 +1245,42 @@
               <w:jc w:val="center"/>
               <w:rPr>
                 <w:rFonts w:ascii="Nirmala UI" w:hAnsi="Nirmala UI" w:cs="Nirmala UI"/>
-                <w:sz w:val="14"/>
-                <w:szCs w:val="14"/>
-              </w:rPr>
-            </w:pPr>
-            <w:r>
-              <w:rPr>
-                <w:rFonts w:ascii="Nirmala UI" w:hAnsi="Nirmala UI" w:cs="Nirmala UI"/>
-                <w:sz w:val="14"/>
-                <w:szCs w:val="14"/>
+                <w:sz w:val="16"/>
+                <w:szCs w:val="16"/>
+              </w:rPr>
+            </w:pPr>
+            <w:r>
+              <w:rPr>
+                <w:rFonts w:ascii="Nirmala UI" w:hAnsi="Nirmala UI" w:cs="Nirmala UI"/>
+                <w:sz w:val="16"/>
+                <w:szCs w:val="16"/>
               </w:rPr>
               <w:t>B</w:t>
+            </w:r>
+          </w:p>
+        </w:tc>
+        <w:tc>
+          <w:tcPr>
+            <w:tcW w:w="426" w:type="dxa"/>
+            <w:shd w:val="clear" w:color="auto" w:fill="F2F2F2" w:themeFill="background1" w:themeFillShade="F2"/>
+            <w:vAlign w:val="center"/>
+          </w:tcPr>
+          <w:p>
+            <w:pPr>
+              <w:jc w:val="center"/>
+              <w:rPr>
+                <w:rFonts w:ascii="Nirmala UI" w:hAnsi="Nirmala UI" w:cs="Nirmala UI"/>
+                <w:sz w:val="16"/>
+                <w:szCs w:val="16"/>
+              </w:rPr>
+            </w:pPr>
+            <w:r>
+              <w:rPr>
+                <w:rFonts w:ascii="Nirmala UI" w:hAnsi="Nirmala UI" w:cs="Nirmala UI"/>
+                <w:sz w:val="16"/>
+                <w:szCs w:val="16"/>
+              </w:rPr>
+              <w:t>R</w:t>
             </w:r>
           </w:p>
         </w:tc>
@@ -1205,17 +1295,67 @@
               <w:jc w:val="center"/>
               <w:rPr>
                 <w:rFonts w:ascii="Nirmala UI" w:hAnsi="Nirmala UI" w:cs="Nirmala UI"/>
-                <w:sz w:val="14"/>
-                <w:szCs w:val="14"/>
-              </w:rPr>
-            </w:pPr>
-            <w:r>
-              <w:rPr>
-                <w:rFonts w:ascii="Nirmala UI" w:hAnsi="Nirmala UI" w:cs="Nirmala UI"/>
-                <w:sz w:val="14"/>
-                <w:szCs w:val="14"/>
-              </w:rPr>
-              <w:t>R</w:t>
+                <w:sz w:val="16"/>
+                <w:szCs w:val="16"/>
+              </w:rPr>
+            </w:pPr>
+            <w:r>
+              <w:rPr>
+                <w:rFonts w:ascii="Nirmala UI" w:hAnsi="Nirmala UI" w:cs="Nirmala UI"/>
+                <w:sz w:val="16"/>
+                <w:szCs w:val="16"/>
+              </w:rPr>
+              <w:t>M</w:t>
+            </w:r>
+          </w:p>
+        </w:tc>
+        <w:tc>
+          <w:tcPr>
+            <w:tcW w:w="425" w:type="dxa"/>
+            <w:shd w:val="clear" w:color="auto" w:fill="F2F2F2" w:themeFill="background1" w:themeFillShade="F2"/>
+            <w:vAlign w:val="center"/>
+          </w:tcPr>
+          <w:p>
+            <w:pPr>
+              <w:jc w:val="center"/>
+              <w:rPr>
+                <w:rFonts w:ascii="Nirmala UI" w:hAnsi="Nirmala UI" w:cs="Nirmala UI"/>
+                <w:sz w:val="16"/>
+                <w:szCs w:val="16"/>
+              </w:rPr>
+            </w:pPr>
+            <w:r>
+              <w:rPr>
+                <w:rFonts w:ascii="Nirmala UI" w:hAnsi="Nirmala UI" w:cs="Nirmala UI"/>
+                <w:sz w:val="16"/>
+                <w:szCs w:val="16"/>
+              </w:rPr>
+              <w:t>1.1</w:t>
+            </w:r>
+          </w:p>
+        </w:tc>
+        <w:tc>
+          <w:tcPr>
+            <w:tcW w:w="425" w:type="dxa"/>
+            <w:shd w:val="clear" w:color="auto" w:fill="F2F2F2" w:themeFill="background1" w:themeFillShade="F2"/>
+            <w:vAlign w:val="center"/>
+          </w:tcPr>
+          <w:p>
+            <w:pPr>
+              <w:jc w:val="center"/>
+              <w:rPr>
+                <w:rFonts w:ascii="Nirmala UI" w:hAnsi="Nirmala UI" w:cs="Nirmala UI"/>
+                <w:sz w:val="16"/>
+                <w:szCs w:val="16"/>
+              </w:rPr>
+            </w:pPr>
+            <w:r>
+              <w:rPr>
+                <w:rFonts w:ascii="Nirmala UI" w:hAnsi="Nirmala UI" w:cs="Nirmala UI"/>
+                <w:sz w:val="16"/>
+                <w:szCs w:val="16"/>
+              </w:rPr>
+              <w:t>1.2</w:t>
             </w:r>
           </w:p>
         </w:tc>
@@ -1230,90 +1370,15 @@
               <w:jc w:val="center"/>
               <w:rPr>
                 <w:rFonts w:ascii="Nirmala UI" w:hAnsi="Nirmala UI" w:cs="Nirmala UI"/>
-                <w:sz w:val="14"/>
-                <w:szCs w:val="14"/>
-              </w:rPr>
-            </w:pPr>
-            <w:r>
-              <w:rPr>
-                <w:rFonts w:ascii="Nirmala UI" w:hAnsi="Nirmala UI" w:cs="Nirmala UI"/>
-                <w:sz w:val="14"/>
-                <w:szCs w:val="14"/>
-              </w:rPr>
-              <w:t>M</w:t>
-            </w:r>
-          </w:p>
-        </w:tc>
-        <w:tc>
-          <w:tcPr>
-            <w:tcW w:w="567" w:type="dxa"/>
-            <w:shd w:val="clear" w:color="auto" w:fill="F2F2F2" w:themeFill="background1" w:themeFillShade="F2"/>
-            <w:vAlign w:val="center"/>
-          </w:tcPr>
-          <w:p>
-            <w:pPr>
-              <w:jc w:val="center"/>
-              <w:rPr>
-                <w:rFonts w:ascii="Nirmala UI" w:hAnsi="Nirmala UI" w:cs="Nirmala UI"/>
-                <w:sz w:val="14"/>
-                <w:szCs w:val="14"/>
-              </w:rPr>
-            </w:pPr>
-            <w:r>
-              <w:rPr>
-                <w:rFonts w:ascii="Nirmala UI" w:hAnsi="Nirmala UI" w:cs="Nirmala UI"/>
-                <w:sz w:val="14"/>
-                <w:szCs w:val="14"/>
-              </w:rPr>
-              <w:t>1.1</w:t>
-            </w:r>
-          </w:p>
-        </w:tc>
-        <w:tc>
-          <w:tcPr>
-            <w:tcW w:w="567" w:type="dxa"/>
-            <w:shd w:val="clear" w:color="auto" w:fill="F2F2F2" w:themeFill="background1" w:themeFillShade="F2"/>
-            <w:vAlign w:val="center"/>
-          </w:tcPr>
-          <w:p>
-            <w:pPr>
-              <w:jc w:val="center"/>
-              <w:rPr>
-                <w:rFonts w:ascii="Nirmala UI" w:hAnsi="Nirmala UI" w:cs="Nirmala UI"/>
-                <w:sz w:val="14"/>
-                <w:szCs w:val="14"/>
-              </w:rPr>
-            </w:pPr>
-            <w:r>
-              <w:rPr>
-                <w:rFonts w:ascii="Nirmala UI" w:hAnsi="Nirmala UI" w:cs="Nirmala UI"/>
-                <w:sz w:val="14"/>
-                <w:szCs w:val="14"/>
-              </w:rPr>
-              <w:t>1.2</w:t>
-            </w:r>
-          </w:p>
-        </w:tc>
-        <w:tc>
-          <w:tcPr>
-            <w:tcW w:w="567" w:type="dxa"/>
-            <w:shd w:val="clear" w:color="auto" w:fill="F2F2F2" w:themeFill="background1" w:themeFillShade="F2"/>
-            <w:vAlign w:val="center"/>
-          </w:tcPr>
-          <w:p>
-            <w:pPr>
-              <w:jc w:val="center"/>
-              <w:rPr>
-                <w:rFonts w:ascii="Nirmala UI" w:hAnsi="Nirmala UI" w:cs="Nirmala UI"/>
-                <w:sz w:val="14"/>
-                <w:szCs w:val="14"/>
-              </w:rPr>
-            </w:pPr>
-            <w:r>
-              <w:rPr>
-                <w:rFonts w:ascii="Nirmala UI" w:hAnsi="Nirmala UI" w:cs="Nirmala UI"/>
-                <w:sz w:val="14"/>
-                <w:szCs w:val="14"/>
+                <w:sz w:val="16"/>
+                <w:szCs w:val="16"/>
+              </w:rPr>
+            </w:pPr>
+            <w:r>
+              <w:rPr>
+                <w:rFonts w:ascii="Nirmala UI" w:hAnsi="Nirmala UI" w:cs="Nirmala UI"/>
+                <w:sz w:val="16"/>
+                <w:szCs w:val="16"/>
               </w:rPr>
               <w:t>1.3</w:t>
             </w:r>
@@ -1326,7 +1391,7 @@
         </w:trPr>
         <w:tc>
           <w:tcPr>
-            <w:tcW w:w="562" w:type="dxa"/>
+            <w:tcW w:w="704" w:type="dxa"/>
             <w:vAlign w:val="center"/>
           </w:tcPr>
           <w:p>
@@ -1381,7 +1446,7 @@
         </w:tc>
         <w:tc>
           <w:tcPr>
-            <w:tcW w:w="851" w:type="dxa"/>
+            <w:tcW w:w="709" w:type="dxa"/>
             <w:vAlign w:val="center"/>
           </w:tcPr>
           <w:p>
@@ -1427,7 +1492,7 @@
         </w:tc>
         <w:tc>
           <w:tcPr>
-            <w:tcW w:w="958" w:type="dxa"/>
+            <w:tcW w:w="1134" w:type="dxa"/>
             <w:vAlign w:val="center"/>
           </w:tcPr>
           <w:p>
@@ -1473,7 +1538,7 @@
         </w:tc>
         <w:tc>
           <w:tcPr>
-            <w:tcW w:w="3011" w:type="dxa"/>
+            <w:tcW w:w="3260" w:type="dxa"/>
             <w:vAlign w:val="center"/>
           </w:tcPr>
           <w:p>
@@ -1658,7 +1723,7 @@
         </w:tc>
         <w:tc>
           <w:tcPr>
-            <w:tcW w:w="567" w:type="dxa"/>
+            <w:tcW w:w="425" w:type="dxa"/>
             <w:vAlign w:val="center"/>
           </w:tcPr>
           <w:p>
@@ -1684,7 +1749,7 @@
         </w:tc>
         <w:tc>
           <w:tcPr>
-            <w:tcW w:w="567" w:type="dxa"/>
+            <w:tcW w:w="425" w:type="dxa"/>
             <w:vAlign w:val="center"/>
           </w:tcPr>
           <w:p>
@@ -1710,7 +1775,7 @@
         </w:tc>
         <w:tc>
           <w:tcPr>
-            <w:tcW w:w="567" w:type="dxa"/>
+            <w:tcW w:w="426" w:type="dxa"/>
             <w:vAlign w:val="center"/>
           </w:tcPr>
           <w:p>
@@ -1806,11 +1871,15 @@
         <w:ind w:left="426"/>
         <w:rPr>
           <w:rFonts w:cstheme="minorHAnsi"/>
+          <w:sz w:val="18"/>
+          <w:szCs w:val="18"/>
         </w:rPr>
       </w:pPr>
       <w:r>
         <w:rPr>
           <w:rFonts w:cstheme="minorHAnsi"/>
+          <w:sz w:val="18"/>
+          <w:szCs w:val="18"/>
         </w:rPr>
         <w:t>{{</w:t>
       </w:r>
@@ -1818,6 +1887,8 @@
       <w:r>
         <w:rPr>
           <w:rFonts w:cstheme="minorHAnsi"/>
+          <w:sz w:val="18"/>
+          <w:szCs w:val="18"/>
         </w:rPr>
         <w:t>detallesDePeso</w:t>
       </w:r>
@@ -1825,6 +1896,8 @@
       <w:r>
         <w:rPr>
           <w:rFonts w:cstheme="minorHAnsi"/>
+          <w:sz w:val="18"/>
+          <w:szCs w:val="18"/>
         </w:rPr>
         <w:t>}}</w:t>
       </w:r>
@@ -3044,7 +3117,7 @@
       </w:tr>
       <w:tr>
         <w:trPr>
-          <w:trHeight w:val="490"/>
+          <w:trHeight w:val="493"/>
         </w:trPr>
         <w:tc>
           <w:tcPr>
@@ -3204,8 +3277,8 @@
       </w:r>
     </w:p>
     <w:sectPr>
-      <w:headerReference w:type="default" r:id="rId7"/>
-      <w:footerReference w:type="default" r:id="rId8"/>
+      <w:headerReference w:type="default" r:id="rId8"/>
+      <w:footerReference w:type="default" r:id="rId9"/>
       <w:pgSz w:w="11906" w:h="16838"/>
       <w:pgMar w:top="1560" w:right="1701" w:bottom="993" w:left="709" w:header="284" w:footer="436" w:gutter="0"/>
       <w:cols w:space="708"/>
@@ -4680,6 +4753,7 @@
   <w:style w:type="character" w:default="1" w:styleId="Fuentedeprrafopredeter">
     <w:name w:val="Default Paragraph Font"/>
     <w:uiPriority w:val="1"/>
+    <w:semiHidden/>
     <w:unhideWhenUsed/>
   </w:style>
   <w:style w:type="table" w:default="1" w:styleId="Tablanormal">
@@ -5073,4 +5147,16 @@
     </a:ext>
   </a:extLst>
 </a:theme>
+</file>
+
+<file path=customXml/item1.xml><?xml version="1.0" encoding="utf-8"?>
+<b:Sources xmlns:b="http://schemas.openxmlformats.org/officeDocument/2006/bibliography" xmlns="http://schemas.openxmlformats.org/officeDocument/2006/bibliography" SelectedStyle="\APASixthEditionOfficeOnline.xsl" StyleName="APA" Version="6"/>
+</file>
+
+<file path=customXml/itemProps1.xml><?xml version="1.0" encoding="utf-8"?>
+<ds:datastoreItem xmlns:ds="http://schemas.openxmlformats.org/officeDocument/2006/customXml" ds:itemID="{F9D08E3F-5C70-478A-B575-4C9CE1A3FF7B}">
+  <ds:schemaRefs>
+    <ds:schemaRef ds:uri="http://schemas.openxmlformats.org/officeDocument/2006/bibliography"/>
+  </ds:schemaRefs>
+</ds:datastoreItem>
 </file>
</xml_diff>